<commit_message>
Added Brittany's figure to media and model guide docx. Updated instructions on model guide.
</commit_message>
<xml_diff>
--- a/ModelGuide/ModelGuidance-LakeMeadWaterBank-TextBoxes.docx
+++ b/ModelGuide/ModelGuidance-LakeMeadWaterBank-TextBoxes.docx
@@ -950,7 +950,29 @@
                                 <w:sz w:val="24"/>
                                 <w:szCs w:val="24"/>
                               </w:rPr>
-                              <w:t xml:space="preserve">116 </w:t>
+                              <w:t>1</w:t>
+                            </w:r>
+                            <w:r>
+                              <w:rPr>
+                                <w:rFonts w:ascii="Times New Roman" w:eastAsia="Times New Roman" w:hAnsi="Times New Roman" w:cs="Times New Roman"/>
+                                <w:b/>
+                                <w:bCs/>
+                                <w:color w:val="00B050"/>
+                                <w:sz w:val="24"/>
+                                <w:szCs w:val="24"/>
+                              </w:rPr>
+                              <w:t>21</w:t>
+                            </w:r>
+                            <w:r>
+                              <w:rPr>
+                                <w:rFonts w:ascii="Times New Roman" w:eastAsia="Times New Roman" w:hAnsi="Times New Roman" w:cs="Times New Roman"/>
+                                <w:b/>
+                                <w:bCs/>
+                                <w:color w:val="00B050"/>
+                                <w:sz w:val="24"/>
+                                <w:szCs w:val="24"/>
+                              </w:rPr>
+                              <w:t xml:space="preserve"> </w:t>
                             </w:r>
                             <w:r>
                               <w:rPr>
@@ -2071,7 +2093,29 @@
                           <w:sz w:val="24"/>
                           <w:szCs w:val="24"/>
                         </w:rPr>
-                        <w:t xml:space="preserve">116 </w:t>
+                        <w:t>1</w:t>
+                      </w:r>
+                      <w:r>
+                        <w:rPr>
+                          <w:rFonts w:ascii="Times New Roman" w:eastAsia="Times New Roman" w:hAnsi="Times New Roman" w:cs="Times New Roman"/>
+                          <w:b/>
+                          <w:bCs/>
+                          <w:color w:val="00B050"/>
+                          <w:sz w:val="24"/>
+                          <w:szCs w:val="24"/>
+                        </w:rPr>
+                        <w:t>21</w:t>
+                      </w:r>
+                      <w:r>
+                        <w:rPr>
+                          <w:rFonts w:ascii="Times New Roman" w:eastAsia="Times New Roman" w:hAnsi="Times New Roman" w:cs="Times New Roman"/>
+                          <w:b/>
+                          <w:bCs/>
+                          <w:color w:val="00B050"/>
+                          <w:sz w:val="24"/>
+                          <w:szCs w:val="24"/>
+                        </w:rPr>
+                        <w:t xml:space="preserve"> </w:t>
                       </w:r>
                       <w:r>
                         <w:rPr>

</xml_diff>